<commit_message>
Finished completing the word document and now updating it in the repository
</commit_message>
<xml_diff>
--- a/Coursework_2 - Word submission template.docx
+++ b/Coursework_2 - Word submission template.docx
@@ -61,6 +61,13 @@
         </w:rPr>
         <w:t>Name:</w:t>
       </w:r>
+      <w:r>
+        <w:rPr>
+          <w:b/>
+          <w:bCs/>
+        </w:rPr>
+        <w:t xml:space="preserve"> Tahir Ahmad</w:t>
+      </w:r>
     </w:p>
     <w:p>
       <w:pPr>
@@ -76,6 +83,27 @@
         </w:rPr>
         <w:t>Student ID:</w:t>
       </w:r>
+      <w:r>
+        <w:rPr>
+          <w:b/>
+          <w:bCs/>
+        </w:rPr>
+        <w:t xml:space="preserve"> 2067</w:t>
+      </w:r>
+      <w:r>
+        <w:rPr>
+          <w:b/>
+          <w:bCs/>
+        </w:rPr>
+        <w:t>8</w:t>
+      </w:r>
+      <w:r>
+        <w:rPr>
+          <w:b/>
+          <w:bCs/>
+        </w:rPr>
+        <w:t>555</w:t>
+      </w:r>
     </w:p>
     <w:p/>
     <w:p>
@@ -135,7 +163,61 @@
         <w:t>here.</w:t>
       </w:r>
     </w:p>
-    <w:p/>
+    <w:p>
+      <w:r>
+        <w:rPr>
+          <w:noProof/>
+        </w:rPr>
+        <w:drawing>
+          <wp:inline distT="0" distB="0" distL="0" distR="0" wp14:anchorId="5F18347E" wp14:editId="0DB094A7">
+            <wp:extent cx="6469380" cy="4852342"/>
+            <wp:effectExtent l="0" t="0" r="0" b="0"/>
+            <wp:docPr id="290328745" name="Picture 2"/>
+            <wp:cNvGraphicFramePr>
+              <a:graphicFrameLocks xmlns:a="http://schemas.openxmlformats.org/drawingml/2006/main" noChangeAspect="1"/>
+            </wp:cNvGraphicFramePr>
+            <a:graphic xmlns:a="http://schemas.openxmlformats.org/drawingml/2006/main">
+              <a:graphicData uri="http://schemas.openxmlformats.org/drawingml/2006/picture">
+                <pic:pic xmlns:pic="http://schemas.openxmlformats.org/drawingml/2006/picture">
+                  <pic:nvPicPr>
+                    <pic:cNvPr id="0" name="Picture 3"/>
+                    <pic:cNvPicPr>
+                      <a:picLocks noChangeAspect="1" noChangeArrowheads="1"/>
+                    </pic:cNvPicPr>
+                  </pic:nvPicPr>
+                  <pic:blipFill>
+                    <a:blip r:embed="rId8" cstate="print">
+                      <a:extLst>
+                        <a:ext uri="{28A0092B-C50C-407E-A947-70E740481C1C}">
+                          <a14:useLocalDpi xmlns:a14="http://schemas.microsoft.com/office/drawing/2010/main" val="0"/>
+                        </a:ext>
+                      </a:extLst>
+                    </a:blip>
+                    <a:srcRect/>
+                    <a:stretch>
+                      <a:fillRect/>
+                    </a:stretch>
+                  </pic:blipFill>
+                  <pic:spPr bwMode="auto">
+                    <a:xfrm flipV="1">
+                      <a:off x="0" y="0"/>
+                      <a:ext cx="6510993" cy="4883554"/>
+                    </a:xfrm>
+                    <a:prstGeom prst="rect">
+                      <a:avLst/>
+                    </a:prstGeom>
+                    <a:noFill/>
+                    <a:ln>
+                      <a:noFill/>
+                    </a:ln>
+                  </pic:spPr>
+                </pic:pic>
+              </a:graphicData>
+            </a:graphic>
+          </wp:inline>
+        </w:drawing>
+      </w:r>
+    </w:p>
     <w:p>
       <w:pPr>
         <w:pStyle w:val="ListParagraph"/>
@@ -166,6 +248,60 @@
         <w:pStyle w:val="ListParagraph"/>
         <w:ind w:left="426"/>
       </w:pPr>
+      <w:r>
+        <w:rPr>
+          <w:noProof/>
+        </w:rPr>
+        <w:lastRenderedPageBreak/>
+        <w:drawing>
+          <wp:inline distT="0" distB="0" distL="0" distR="0" wp14:anchorId="1DBE8070" wp14:editId="0009D06D">
+            <wp:extent cx="6645910" cy="3993515"/>
+            <wp:effectExtent l="0" t="0" r="0" b="0"/>
+            <wp:docPr id="1434531395" name="Picture 3"/>
+            <wp:cNvGraphicFramePr>
+              <a:graphicFrameLocks xmlns:a="http://schemas.openxmlformats.org/drawingml/2006/main" noChangeAspect="1"/>
+            </wp:cNvGraphicFramePr>
+            <a:graphic xmlns:a="http://schemas.openxmlformats.org/drawingml/2006/main">
+              <a:graphicData uri="http://schemas.openxmlformats.org/drawingml/2006/picture">
+                <pic:pic xmlns:pic="http://schemas.openxmlformats.org/drawingml/2006/picture">
+                  <pic:nvPicPr>
+                    <pic:cNvPr id="0" name="Picture 5"/>
+                    <pic:cNvPicPr>
+                      <a:picLocks noChangeAspect="1" noChangeArrowheads="1"/>
+                    </pic:cNvPicPr>
+                  </pic:nvPicPr>
+                  <pic:blipFill>
+                    <a:blip r:embed="rId9">
+                      <a:extLst>
+                        <a:ext uri="{28A0092B-C50C-407E-A947-70E740481C1C}">
+                          <a14:useLocalDpi xmlns:a14="http://schemas.microsoft.com/office/drawing/2010/main" val="0"/>
+                        </a:ext>
+                      </a:extLst>
+                    </a:blip>
+                    <a:srcRect/>
+                    <a:stretch>
+                      <a:fillRect/>
+                    </a:stretch>
+                  </pic:blipFill>
+                  <pic:spPr bwMode="auto">
+                    <a:xfrm>
+                      <a:off x="0" y="0"/>
+                      <a:ext cx="6645910" cy="3993515"/>
+                    </a:xfrm>
+                    <a:prstGeom prst="rect">
+                      <a:avLst/>
+                    </a:prstGeom>
+                    <a:noFill/>
+                    <a:ln>
+                      <a:noFill/>
+                    </a:ln>
+                  </pic:spPr>
+                </pic:pic>
+              </a:graphicData>
+            </a:graphic>
+          </wp:inline>
+        </w:drawing>
+      </w:r>
     </w:p>
     <w:p>
       <w:pPr>
@@ -199,7 +335,61 @@
         <w:t>Include a photograph of the implementation here.</w:t>
       </w:r>
     </w:p>
-    <w:p/>
+    <w:p>
+      <w:r>
+        <w:rPr>
+          <w:noProof/>
+        </w:rPr>
+        <w:drawing>
+          <wp:inline distT="0" distB="0" distL="0" distR="0" wp14:anchorId="67355748" wp14:editId="15342D0A">
+            <wp:extent cx="4632960" cy="3474942"/>
+            <wp:effectExtent l="0" t="0" r="0" b="0"/>
+            <wp:docPr id="540823643" name="Picture 4"/>
+            <wp:cNvGraphicFramePr>
+              <a:graphicFrameLocks xmlns:a="http://schemas.openxmlformats.org/drawingml/2006/main" noChangeAspect="1"/>
+            </wp:cNvGraphicFramePr>
+            <a:graphic xmlns:a="http://schemas.openxmlformats.org/drawingml/2006/main">
+              <a:graphicData uri="http://schemas.openxmlformats.org/drawingml/2006/picture">
+                <pic:pic xmlns:pic="http://schemas.openxmlformats.org/drawingml/2006/picture">
+                  <pic:nvPicPr>
+                    <pic:cNvPr id="0" name="Picture 7"/>
+                    <pic:cNvPicPr>
+                      <a:picLocks noChangeAspect="1" noChangeArrowheads="1"/>
+                    </pic:cNvPicPr>
+                  </pic:nvPicPr>
+                  <pic:blipFill>
+                    <a:blip r:embed="rId10" cstate="print">
+                      <a:extLst>
+                        <a:ext uri="{28A0092B-C50C-407E-A947-70E740481C1C}">
+                          <a14:useLocalDpi xmlns:a14="http://schemas.microsoft.com/office/drawing/2010/main" val="0"/>
+                        </a:ext>
+                      </a:extLst>
+                    </a:blip>
+                    <a:srcRect/>
+                    <a:stretch>
+                      <a:fillRect/>
+                    </a:stretch>
+                  </pic:blipFill>
+                  <pic:spPr bwMode="auto">
+                    <a:xfrm>
+                      <a:off x="0" y="0"/>
+                      <a:ext cx="4638807" cy="3479327"/>
+                    </a:xfrm>
+                    <a:prstGeom prst="rect">
+                      <a:avLst/>
+                    </a:prstGeom>
+                    <a:noFill/>
+                    <a:ln>
+                      <a:noFill/>
+                    </a:ln>
+                  </pic:spPr>
+                </pic:pic>
+              </a:graphicData>
+            </a:graphic>
+          </wp:inline>
+        </w:drawing>
+      </w:r>
+    </w:p>
     <w:p>
       <w:pPr>
         <w:pStyle w:val="ListParagraph"/>
@@ -210,6 +400,7 @@
         <w:jc w:val="left"/>
       </w:pPr>
       <w:r>
+        <w:lastRenderedPageBreak/>
         <w:t>Include your</w:t>
       </w:r>
       <w:r>
@@ -223,6 +414,59 @@
       <w:pPr>
         <w:jc w:val="left"/>
       </w:pPr>
+      <w:r>
+        <w:rPr>
+          <w:noProof/>
+        </w:rPr>
+        <w:drawing>
+          <wp:inline distT="0" distB="0" distL="0" distR="0" wp14:anchorId="57F76B60" wp14:editId="1C261787">
+            <wp:extent cx="2569830" cy="3634740"/>
+            <wp:effectExtent l="0" t="0" r="0" b="0"/>
+            <wp:docPr id="245741407" name="Picture 5"/>
+            <wp:cNvGraphicFramePr>
+              <a:graphicFrameLocks xmlns:a="http://schemas.openxmlformats.org/drawingml/2006/main" noChangeAspect="1"/>
+            </wp:cNvGraphicFramePr>
+            <a:graphic xmlns:a="http://schemas.openxmlformats.org/drawingml/2006/main">
+              <a:graphicData uri="http://schemas.openxmlformats.org/drawingml/2006/picture">
+                <pic:pic xmlns:pic="http://schemas.openxmlformats.org/drawingml/2006/picture">
+                  <pic:nvPicPr>
+                    <pic:cNvPr id="0" name="Picture 9"/>
+                    <pic:cNvPicPr>
+                      <a:picLocks noChangeAspect="1" noChangeArrowheads="1"/>
+                    </pic:cNvPicPr>
+                  </pic:nvPicPr>
+                  <pic:blipFill>
+                    <a:blip r:embed="rId11" cstate="print">
+                      <a:extLst>
+                        <a:ext uri="{28A0092B-C50C-407E-A947-70E740481C1C}">
+                          <a14:useLocalDpi xmlns:a14="http://schemas.microsoft.com/office/drawing/2010/main" val="0"/>
+                        </a:ext>
+                      </a:extLst>
+                    </a:blip>
+                    <a:srcRect/>
+                    <a:stretch>
+                      <a:fillRect/>
+                    </a:stretch>
+                  </pic:blipFill>
+                  <pic:spPr bwMode="auto">
+                    <a:xfrm>
+                      <a:off x="0" y="0"/>
+                      <a:ext cx="2577543" cy="3645649"/>
+                    </a:xfrm>
+                    <a:prstGeom prst="rect">
+                      <a:avLst/>
+                    </a:prstGeom>
+                    <a:noFill/>
+                    <a:ln>
+                      <a:noFill/>
+                    </a:ln>
+                  </pic:spPr>
+                </pic:pic>
+              </a:graphicData>
+            </a:graphic>
+          </wp:inline>
+        </w:drawing>
+      </w:r>
     </w:p>
     <w:p>
       <w:pPr>
@@ -247,6 +491,43 @@
       <w:pPr>
         <w:jc w:val="left"/>
       </w:pPr>
+      <w:r>
+        <w:drawing>
+          <wp:inline distT="0" distB="0" distL="0" distR="0" wp14:anchorId="4CDFE4F5" wp14:editId="6338F634">
+            <wp:extent cx="6645910" cy="4259580"/>
+            <wp:effectExtent l="0" t="0" r="0" b="0"/>
+            <wp:docPr id="292383605" name="Picture 1"/>
+            <wp:cNvGraphicFramePr>
+              <a:graphicFrameLocks xmlns:a="http://schemas.openxmlformats.org/drawingml/2006/main" noChangeAspect="1"/>
+            </wp:cNvGraphicFramePr>
+            <a:graphic xmlns:a="http://schemas.openxmlformats.org/drawingml/2006/main">
+              <a:graphicData uri="http://schemas.openxmlformats.org/drawingml/2006/picture">
+                <pic:pic xmlns:pic="http://schemas.openxmlformats.org/drawingml/2006/picture">
+                  <pic:nvPicPr>
+                    <pic:cNvPr id="292383605" name=""/>
+                    <pic:cNvPicPr/>
+                  </pic:nvPicPr>
+                  <pic:blipFill>
+                    <a:blip r:embed="rId12"/>
+                    <a:stretch>
+                      <a:fillRect/>
+                    </a:stretch>
+                  </pic:blipFill>
+                  <pic:spPr>
+                    <a:xfrm>
+                      <a:off x="0" y="0"/>
+                      <a:ext cx="6645910" cy="4259580"/>
+                    </a:xfrm>
+                    <a:prstGeom prst="rect">
+                      <a:avLst/>
+                    </a:prstGeom>
+                  </pic:spPr>
+                </pic:pic>
+              </a:graphicData>
+            </a:graphic>
+          </wp:inline>
+        </w:drawing>
+      </w:r>
     </w:p>
     <w:p>
       <w:pPr>
@@ -258,6 +539,7 @@
         <w:jc w:val="left"/>
       </w:pPr>
       <w:r>
+        <w:lastRenderedPageBreak/>
         <w:t>Include your final flowchart here.</w:t>
       </w:r>
     </w:p>
@@ -266,6 +548,59 @@
         <w:pStyle w:val="ListParagraph"/>
         <w:jc w:val="left"/>
       </w:pPr>
+      <w:r>
+        <w:rPr>
+          <w:noProof/>
+        </w:rPr>
+        <w:drawing>
+          <wp:inline distT="0" distB="0" distL="0" distR="0" wp14:anchorId="2075F989" wp14:editId="05EE2324">
+            <wp:extent cx="2629091" cy="3718560"/>
+            <wp:effectExtent l="0" t="0" r="0" b="0"/>
+            <wp:docPr id="879283622" name="Picture 6"/>
+            <wp:cNvGraphicFramePr>
+              <a:graphicFrameLocks xmlns:a="http://schemas.openxmlformats.org/drawingml/2006/main" noChangeAspect="1"/>
+            </wp:cNvGraphicFramePr>
+            <a:graphic xmlns:a="http://schemas.openxmlformats.org/drawingml/2006/main">
+              <a:graphicData uri="http://schemas.openxmlformats.org/drawingml/2006/picture">
+                <pic:pic xmlns:pic="http://schemas.openxmlformats.org/drawingml/2006/picture">
+                  <pic:nvPicPr>
+                    <pic:cNvPr id="0" name="Picture 11"/>
+                    <pic:cNvPicPr>
+                      <a:picLocks noChangeAspect="1" noChangeArrowheads="1"/>
+                    </pic:cNvPicPr>
+                  </pic:nvPicPr>
+                  <pic:blipFill>
+                    <a:blip r:embed="rId13" cstate="print">
+                      <a:extLst>
+                        <a:ext uri="{28A0092B-C50C-407E-A947-70E740481C1C}">
+                          <a14:useLocalDpi xmlns:a14="http://schemas.microsoft.com/office/drawing/2010/main" val="0"/>
+                        </a:ext>
+                      </a:extLst>
+                    </a:blip>
+                    <a:srcRect/>
+                    <a:stretch>
+                      <a:fillRect/>
+                    </a:stretch>
+                  </pic:blipFill>
+                  <pic:spPr bwMode="auto">
+                    <a:xfrm>
+                      <a:off x="0" y="0"/>
+                      <a:ext cx="2639704" cy="3733571"/>
+                    </a:xfrm>
+                    <a:prstGeom prst="rect">
+                      <a:avLst/>
+                    </a:prstGeom>
+                    <a:noFill/>
+                    <a:ln>
+                      <a:noFill/>
+                    </a:ln>
+                  </pic:spPr>
+                </pic:pic>
+              </a:graphicData>
+            </a:graphic>
+          </wp:inline>
+        </w:drawing>
+      </w:r>
     </w:p>
     <w:p>
       <w:pPr>
@@ -307,6 +642,59 @@
         <w:ind w:left="709"/>
         <w:jc w:val="left"/>
       </w:pPr>
+      <w:r>
+        <w:rPr>
+          <w:noProof/>
+        </w:rPr>
+        <w:drawing>
+          <wp:inline distT="0" distB="0" distL="0" distR="0" wp14:anchorId="65DD82BD" wp14:editId="4A24A26A">
+            <wp:extent cx="2720680" cy="3848100"/>
+            <wp:effectExtent l="0" t="0" r="0" b="0"/>
+            <wp:docPr id="1984946186" name="Picture 7"/>
+            <wp:cNvGraphicFramePr>
+              <a:graphicFrameLocks xmlns:a="http://schemas.openxmlformats.org/drawingml/2006/main" noChangeAspect="1"/>
+            </wp:cNvGraphicFramePr>
+            <a:graphic xmlns:a="http://schemas.openxmlformats.org/drawingml/2006/main">
+              <a:graphicData uri="http://schemas.openxmlformats.org/drawingml/2006/picture">
+                <pic:pic xmlns:pic="http://schemas.openxmlformats.org/drawingml/2006/picture">
+                  <pic:nvPicPr>
+                    <pic:cNvPr id="0" name="Picture 13"/>
+                    <pic:cNvPicPr>
+                      <a:picLocks noChangeAspect="1" noChangeArrowheads="1"/>
+                    </pic:cNvPicPr>
+                  </pic:nvPicPr>
+                  <pic:blipFill>
+                    <a:blip r:embed="rId14" cstate="print">
+                      <a:extLst>
+                        <a:ext uri="{28A0092B-C50C-407E-A947-70E740481C1C}">
+                          <a14:useLocalDpi xmlns:a14="http://schemas.microsoft.com/office/drawing/2010/main" val="0"/>
+                        </a:ext>
+                      </a:extLst>
+                    </a:blip>
+                    <a:srcRect/>
+                    <a:stretch>
+                      <a:fillRect/>
+                    </a:stretch>
+                  </pic:blipFill>
+                  <pic:spPr bwMode="auto">
+                    <a:xfrm>
+                      <a:off x="0" y="0"/>
+                      <a:ext cx="2730221" cy="3861595"/>
+                    </a:xfrm>
+                    <a:prstGeom prst="rect">
+                      <a:avLst/>
+                    </a:prstGeom>
+                    <a:noFill/>
+                    <a:ln>
+                      <a:noFill/>
+                    </a:ln>
+                  </pic:spPr>
+                </pic:pic>
+              </a:graphicData>
+            </a:graphic>
+          </wp:inline>
+        </w:drawing>
+      </w:r>
     </w:p>
     <w:p>
       <w:pPr>
@@ -341,6 +729,81 @@
       </w:r>
     </w:p>
     <w:p>
+      <w:r>
+        <w:t xml:space="preserve">This coursework provided a great introduction to integrate hardware and software. It also demonstrated how MATLAB can be useful to communicate to hardware that was meant to be for a different programming language by using add </w:t>
+      </w:r>
+      <w:proofErr w:type="spellStart"/>
+      <w:r>
+        <w:t>ons</w:t>
+      </w:r>
+      <w:proofErr w:type="spellEnd"/>
+      <w:r>
+        <w:t>.</w:t>
+      </w:r>
+    </w:p>
+    <w:p>
+      <w:r>
+        <w:t xml:space="preserve">Early in the coursework it was a bit difficult to set up the </w:t>
+      </w:r>
+      <w:proofErr w:type="gramStart"/>
+      <w:r>
+        <w:t>breadboard</w:t>
+      </w:r>
+      <w:proofErr w:type="gramEnd"/>
+      <w:r>
+        <w:t xml:space="preserve"> so I watched some demonstration videos to understand the breadboard circuit configuration. Once I understood it proved to be straightforward. Along with this understanding how to use git hub also proved to be quite complicated because I didn't understand most of the terminology and it took some time to configure but once configured correctly, I found it </w:t>
+      </w:r>
+      <w:proofErr w:type="gramStart"/>
+      <w:r>
+        <w:t>fairly simple</w:t>
+      </w:r>
+      <w:proofErr w:type="gramEnd"/>
+      <w:r>
+        <w:t>.</w:t>
+      </w:r>
+    </w:p>
+    <w:p>
+      <w:r>
+        <w:t xml:space="preserve">The initial testing where an LED was turned on and off through a digital pin on Arduino was also quite helpful because I could try different configurations and found the optimal one for myself and since it isn't </w:t>
+      </w:r>
+      <w:proofErr w:type="gramStart"/>
+      <w:r>
+        <w:t>graded</w:t>
+      </w:r>
+      <w:proofErr w:type="gramEnd"/>
+      <w:r>
+        <w:t xml:space="preserve"> I had the freedom to make mistakes and learn.</w:t>
+      </w:r>
+    </w:p>
+    <w:p>
+      <w:r>
+        <w:t>Task 1 required to collect data from the thermistor and convert it in the temperature reading which was very helpful in understanding how we can repurpose different components for our use and it was fascinating how a resistor can be used to tell the temperature. It was a bit of a challenge to find the correct equation to convert resistant value into temperature. I also connected the thermistor the wrong way around and because of that the temperature readings were close to 400 degrees with took some time to find the mistake. Formatting outputs and generating plots reinforced my ability to present data more concisely.</w:t>
+      </w:r>
+    </w:p>
+    <w:p>
+      <w:r>
+        <w:t xml:space="preserve">Task 2 was interesting because now the simple data collection and processing changed into a </w:t>
+      </w:r>
+      <w:proofErr w:type="gramStart"/>
+      <w:r>
+        <w:t>real world</w:t>
+      </w:r>
+      <w:proofErr w:type="gramEnd"/>
+      <w:r>
+        <w:t xml:space="preserve"> device using conditional statements. Designing LED control logic highlighted the importance of thresholds. To improve reliability of the system I also understood the importance of resetting outputs within loops. The use of function made the programming straightforward and easy to debug.</w:t>
+      </w:r>
+    </w:p>
+    <w:p>
+      <w:r>
+        <w:t>Task 3 built upon the 2nd task by including predictive modelling through rate of change calculations. This helped in understanding dynamic systems.</w:t>
+      </w:r>
+    </w:p>
+    <w:p>
+      <w:r>
+        <w:t>In conclusion the coursework improved my ability to design and test system. It revealed how simple electronic devices can be used to collect real world data and implement it to make useful electronic devices and how they are useful in aerospace industry.</w:t>
+      </w:r>
+    </w:p>
+    <w:p>
       <w:pPr>
         <w:pStyle w:val="ListParagraph"/>
         <w:ind w:left="709"/>
@@ -348,8 +811,8 @@
       </w:pPr>
     </w:p>
     <w:sectPr>
-      <w:headerReference w:type="default" r:id="rId8"/>
-      <w:headerReference w:type="first" r:id="rId9"/>
+      <w:headerReference w:type="default" r:id="rId15"/>
+      <w:headerReference w:type="first" r:id="rId16"/>
       <w:pgSz w:w="11906" w:h="16838"/>
       <w:pgMar w:top="720" w:right="720" w:bottom="720" w:left="720" w:header="708" w:footer="708" w:gutter="0"/>
       <w:cols w:space="708"/>

</xml_diff>